<commit_message>
Actualización de archivos de EDA:
- Añadido documento con conclusiones de EDA
- Modificado notebook de EDA
- Actualizado proceso de análisis de datos
- Actualizadas funciones de limpieza y análisis
</commit_message>
<xml_diff>
--- a/diego_data_clean/Proceso de análisis de datos .docx
+++ b/diego_data_clean/Proceso de análisis de datos .docx
@@ -46,8 +46,23 @@
         <w:rPr>
           <w:lang w:val="es-ES"/>
         </w:rPr>
-        <w:t xml:space="preserve">Se han renombrado las columnas para mejorar la claridad, consistencia y comprensión del dataset, utilizando nombres más descriptivos y siguiendo el formato </w:t>
-      </w:r>
+        <w:t xml:space="preserve">Se han renombrado las columnas para mejorar la claridad, consistencia y comprensión del </w:t>
+      </w:r>
+      <w:proofErr w:type="spellStart"/>
+      <w:r>
+        <w:rPr>
+          <w:lang w:val="es-ES"/>
+        </w:rPr>
+        <w:t>dataset</w:t>
+      </w:r>
+      <w:proofErr w:type="spellEnd"/>
+      <w:r>
+        <w:rPr>
+          <w:lang w:val="es-ES"/>
+        </w:rPr>
+        <w:t xml:space="preserve">, utilizando nombres más descriptivos y siguiendo el formato </w:t>
+      </w:r>
+      <w:proofErr w:type="spellStart"/>
       <w:r>
         <w:rPr>
           <w:i/>
@@ -56,6 +71,7 @@
         </w:rPr>
         <w:t>snake_case</w:t>
       </w:r>
+      <w:proofErr w:type="spellEnd"/>
       <w:r>
         <w:rPr>
           <w:lang w:val="es-ES"/>
@@ -174,32 +190,36 @@
                 <w:lang w:val="es-ES"/>
               </w:rPr>
             </w:pPr>
+            <w:proofErr w:type="spellStart"/>
             <w:r>
               <w:rPr>
                 <w:lang w:val="es-ES"/>
               </w:rPr>
               <w:t>job</w:t>
             </w:r>
-          </w:p>
-        </w:tc>
-        <w:tc>
-          <w:tcPr>
-            <w:tcW w:w="0" w:type="auto"/>
-            <w:vAlign w:val="center"/>
-            <w:hideMark/>
-          </w:tcPr>
-          <w:p>
-            <w:pPr>
-              <w:rPr>
-                <w:lang w:val="es-ES"/>
-              </w:rPr>
-            </w:pPr>
+            <w:proofErr w:type="spellEnd"/>
+          </w:p>
+        </w:tc>
+        <w:tc>
+          <w:tcPr>
+            <w:tcW w:w="0" w:type="auto"/>
+            <w:vAlign w:val="center"/>
+            <w:hideMark/>
+          </w:tcPr>
+          <w:p>
+            <w:pPr>
+              <w:rPr>
+                <w:lang w:val="es-ES"/>
+              </w:rPr>
+            </w:pPr>
+            <w:proofErr w:type="spellStart"/>
             <w:r>
               <w:rPr>
                 <w:lang w:val="es-ES"/>
               </w:rPr>
               <w:t>job_type</w:t>
             </w:r>
+            <w:proofErr w:type="spellEnd"/>
           </w:p>
         </w:tc>
         <w:tc>
@@ -259,12 +279,22 @@
                 <w:lang w:val="es-ES"/>
               </w:rPr>
             </w:pPr>
-            <w:r>
-              <w:rPr>
-                <w:lang w:val="es-ES"/>
-              </w:rPr>
-              <w:t>marital_status</w:t>
-            </w:r>
+            <w:proofErr w:type="spellStart"/>
+            <w:r>
+              <w:rPr>
+                <w:lang w:val="es-ES"/>
+              </w:rPr>
+              <w:t>marital_</w:t>
+            </w:r>
+            <w:proofErr w:type="gramStart"/>
+            <w:r>
+              <w:rPr>
+                <w:lang w:val="es-ES"/>
+              </w:rPr>
+              <w:t>status</w:t>
+            </w:r>
+            <w:proofErr w:type="spellEnd"/>
+            <w:proofErr w:type="gramEnd"/>
           </w:p>
         </w:tc>
         <w:tc>
@@ -304,32 +334,36 @@
                 <w:lang w:val="es-ES"/>
               </w:rPr>
             </w:pPr>
+            <w:proofErr w:type="spellStart"/>
             <w:r>
               <w:rPr>
                 <w:lang w:val="es-ES"/>
               </w:rPr>
               <w:t>education</w:t>
             </w:r>
-          </w:p>
-        </w:tc>
-        <w:tc>
-          <w:tcPr>
-            <w:tcW w:w="0" w:type="auto"/>
-            <w:vAlign w:val="center"/>
-            <w:hideMark/>
-          </w:tcPr>
-          <w:p>
-            <w:pPr>
-              <w:rPr>
-                <w:lang w:val="es-ES"/>
-              </w:rPr>
-            </w:pPr>
+            <w:proofErr w:type="spellEnd"/>
+          </w:p>
+        </w:tc>
+        <w:tc>
+          <w:tcPr>
+            <w:tcW w:w="0" w:type="auto"/>
+            <w:vAlign w:val="center"/>
+            <w:hideMark/>
+          </w:tcPr>
+          <w:p>
+            <w:pPr>
+              <w:rPr>
+                <w:lang w:val="es-ES"/>
+              </w:rPr>
+            </w:pPr>
+            <w:proofErr w:type="spellStart"/>
             <w:r>
               <w:rPr>
                 <w:lang w:val="es-ES"/>
               </w:rPr>
               <w:t>education_level</w:t>
             </w:r>
+            <w:proofErr w:type="spellEnd"/>
           </w:p>
         </w:tc>
         <w:tc>
@@ -389,12 +423,14 @@
                 <w:lang w:val="es-ES"/>
               </w:rPr>
             </w:pPr>
+            <w:proofErr w:type="spellStart"/>
             <w:r>
               <w:rPr>
                 <w:lang w:val="es-ES"/>
               </w:rPr>
               <w:t>has_personal_loan</w:t>
             </w:r>
+            <w:proofErr w:type="spellEnd"/>
           </w:p>
         </w:tc>
         <w:tc>
@@ -434,32 +470,36 @@
                 <w:lang w:val="es-ES"/>
               </w:rPr>
             </w:pPr>
+            <w:proofErr w:type="spellStart"/>
             <w:r>
               <w:rPr>
                 <w:lang w:val="es-ES"/>
               </w:rPr>
               <w:t>housing</w:t>
             </w:r>
-          </w:p>
-        </w:tc>
-        <w:tc>
-          <w:tcPr>
-            <w:tcW w:w="0" w:type="auto"/>
-            <w:vAlign w:val="center"/>
-            <w:hideMark/>
-          </w:tcPr>
-          <w:p>
-            <w:pPr>
-              <w:rPr>
-                <w:lang w:val="es-ES"/>
-              </w:rPr>
-            </w:pPr>
+            <w:proofErr w:type="spellEnd"/>
+          </w:p>
+        </w:tc>
+        <w:tc>
+          <w:tcPr>
+            <w:tcW w:w="0" w:type="auto"/>
+            <w:vAlign w:val="center"/>
+            <w:hideMark/>
+          </w:tcPr>
+          <w:p>
+            <w:pPr>
+              <w:rPr>
+                <w:lang w:val="es-ES"/>
+              </w:rPr>
+            </w:pPr>
+            <w:proofErr w:type="spellStart"/>
             <w:r>
               <w:rPr>
                 <w:lang w:val="es-ES"/>
               </w:rPr>
               <w:t>has_housing_loan</w:t>
             </w:r>
+            <w:proofErr w:type="spellEnd"/>
           </w:p>
         </w:tc>
         <w:tc>
@@ -499,32 +539,36 @@
                 <w:lang w:val="es-ES"/>
               </w:rPr>
             </w:pPr>
+            <w:proofErr w:type="spellStart"/>
             <w:r>
               <w:rPr>
                 <w:lang w:val="es-ES"/>
               </w:rPr>
               <w:t>month</w:t>
             </w:r>
-          </w:p>
-        </w:tc>
-        <w:tc>
-          <w:tcPr>
-            <w:tcW w:w="0" w:type="auto"/>
-            <w:vAlign w:val="center"/>
-            <w:hideMark/>
-          </w:tcPr>
-          <w:p>
-            <w:pPr>
-              <w:rPr>
-                <w:lang w:val="es-ES"/>
-              </w:rPr>
-            </w:pPr>
+            <w:proofErr w:type="spellEnd"/>
+          </w:p>
+        </w:tc>
+        <w:tc>
+          <w:tcPr>
+            <w:tcW w:w="0" w:type="auto"/>
+            <w:vAlign w:val="center"/>
+            <w:hideMark/>
+          </w:tcPr>
+          <w:p>
+            <w:pPr>
+              <w:rPr>
+                <w:lang w:val="es-ES"/>
+              </w:rPr>
+            </w:pPr>
+            <w:proofErr w:type="spellStart"/>
             <w:r>
               <w:rPr>
                 <w:lang w:val="es-ES"/>
               </w:rPr>
               <w:t>contact_month</w:t>
             </w:r>
+            <w:proofErr w:type="spellEnd"/>
           </w:p>
         </w:tc>
         <w:tc>
@@ -564,32 +608,36 @@
                 <w:lang w:val="es-ES"/>
               </w:rPr>
             </w:pPr>
+            <w:proofErr w:type="spellStart"/>
             <w:r>
               <w:rPr>
                 <w:lang w:val="es-ES"/>
               </w:rPr>
               <w:t>day_of_week</w:t>
             </w:r>
-          </w:p>
-        </w:tc>
-        <w:tc>
-          <w:tcPr>
-            <w:tcW w:w="0" w:type="auto"/>
-            <w:vAlign w:val="center"/>
-            <w:hideMark/>
-          </w:tcPr>
-          <w:p>
-            <w:pPr>
-              <w:rPr>
-                <w:lang w:val="es-ES"/>
-              </w:rPr>
-            </w:pPr>
+            <w:proofErr w:type="spellEnd"/>
+          </w:p>
+        </w:tc>
+        <w:tc>
+          <w:tcPr>
+            <w:tcW w:w="0" w:type="auto"/>
+            <w:vAlign w:val="center"/>
+            <w:hideMark/>
+          </w:tcPr>
+          <w:p>
+            <w:pPr>
+              <w:rPr>
+                <w:lang w:val="es-ES"/>
+              </w:rPr>
+            </w:pPr>
+            <w:proofErr w:type="spellStart"/>
             <w:r>
               <w:rPr>
                 <w:lang w:val="es-ES"/>
               </w:rPr>
               <w:t>contact_day</w:t>
             </w:r>
+            <w:proofErr w:type="spellEnd"/>
           </w:p>
         </w:tc>
         <w:tc>
@@ -629,32 +677,36 @@
                 <w:lang w:val="es-ES"/>
               </w:rPr>
             </w:pPr>
+            <w:proofErr w:type="spellStart"/>
             <w:r>
               <w:rPr>
                 <w:lang w:val="es-ES"/>
               </w:rPr>
               <w:t>contact</w:t>
             </w:r>
-          </w:p>
-        </w:tc>
-        <w:tc>
-          <w:tcPr>
-            <w:tcW w:w="0" w:type="auto"/>
-            <w:vAlign w:val="center"/>
-            <w:hideMark/>
-          </w:tcPr>
-          <w:p>
-            <w:pPr>
-              <w:rPr>
-                <w:lang w:val="es-ES"/>
-              </w:rPr>
-            </w:pPr>
+            <w:proofErr w:type="spellEnd"/>
+          </w:p>
+        </w:tc>
+        <w:tc>
+          <w:tcPr>
+            <w:tcW w:w="0" w:type="auto"/>
+            <w:vAlign w:val="center"/>
+            <w:hideMark/>
+          </w:tcPr>
+          <w:p>
+            <w:pPr>
+              <w:rPr>
+                <w:lang w:val="es-ES"/>
+              </w:rPr>
+            </w:pPr>
+            <w:proofErr w:type="spellStart"/>
             <w:r>
               <w:rPr>
                 <w:lang w:val="es-ES"/>
               </w:rPr>
               <w:t>contact_method</w:t>
             </w:r>
+            <w:proofErr w:type="spellEnd"/>
           </w:p>
         </w:tc>
         <w:tc>
@@ -694,32 +746,36 @@
                 <w:lang w:val="es-ES"/>
               </w:rPr>
             </w:pPr>
+            <w:proofErr w:type="spellStart"/>
             <w:r>
               <w:rPr>
                 <w:lang w:val="es-ES"/>
               </w:rPr>
               <w:t>duration</w:t>
             </w:r>
-          </w:p>
-        </w:tc>
-        <w:tc>
-          <w:tcPr>
-            <w:tcW w:w="0" w:type="auto"/>
-            <w:vAlign w:val="center"/>
-            <w:hideMark/>
-          </w:tcPr>
-          <w:p>
-            <w:pPr>
-              <w:rPr>
-                <w:lang w:val="es-ES"/>
-              </w:rPr>
-            </w:pPr>
+            <w:proofErr w:type="spellEnd"/>
+          </w:p>
+        </w:tc>
+        <w:tc>
+          <w:tcPr>
+            <w:tcW w:w="0" w:type="auto"/>
+            <w:vAlign w:val="center"/>
+            <w:hideMark/>
+          </w:tcPr>
+          <w:p>
+            <w:pPr>
+              <w:rPr>
+                <w:lang w:val="es-ES"/>
+              </w:rPr>
+            </w:pPr>
+            <w:proofErr w:type="spellStart"/>
             <w:r>
               <w:rPr>
                 <w:lang w:val="es-ES"/>
               </w:rPr>
               <w:t>call_duration</w:t>
             </w:r>
+            <w:proofErr w:type="spellEnd"/>
           </w:p>
         </w:tc>
         <w:tc>
@@ -779,12 +835,14 @@
                 <w:lang w:val="es-ES"/>
               </w:rPr>
             </w:pPr>
+            <w:proofErr w:type="spellStart"/>
             <w:r>
               <w:rPr>
                 <w:lang w:val="es-ES"/>
               </w:rPr>
               <w:t>credit_default</w:t>
             </w:r>
+            <w:proofErr w:type="spellEnd"/>
           </w:p>
         </w:tc>
         <w:tc>
@@ -824,32 +882,36 @@
                 <w:lang w:val="es-ES"/>
               </w:rPr>
             </w:pPr>
+            <w:proofErr w:type="spellStart"/>
             <w:r>
               <w:rPr>
                 <w:lang w:val="es-ES"/>
               </w:rPr>
               <w:t>campaign</w:t>
             </w:r>
-          </w:p>
-        </w:tc>
-        <w:tc>
-          <w:tcPr>
-            <w:tcW w:w="0" w:type="auto"/>
-            <w:vAlign w:val="center"/>
-            <w:hideMark/>
-          </w:tcPr>
-          <w:p>
-            <w:pPr>
-              <w:rPr>
-                <w:lang w:val="es-ES"/>
-              </w:rPr>
-            </w:pPr>
+            <w:proofErr w:type="spellEnd"/>
+          </w:p>
+        </w:tc>
+        <w:tc>
+          <w:tcPr>
+            <w:tcW w:w="0" w:type="auto"/>
+            <w:vAlign w:val="center"/>
+            <w:hideMark/>
+          </w:tcPr>
+          <w:p>
+            <w:pPr>
+              <w:rPr>
+                <w:lang w:val="es-ES"/>
+              </w:rPr>
+            </w:pPr>
+            <w:proofErr w:type="spellStart"/>
             <w:r>
               <w:rPr>
                 <w:lang w:val="es-ES"/>
               </w:rPr>
               <w:t>contact_attempts</w:t>
             </w:r>
+            <w:proofErr w:type="spellEnd"/>
           </w:p>
         </w:tc>
         <w:tc>
@@ -889,32 +951,36 @@
                 <w:lang w:val="es-ES"/>
               </w:rPr>
             </w:pPr>
+            <w:proofErr w:type="spellStart"/>
             <w:r>
               <w:rPr>
                 <w:lang w:val="es-ES"/>
               </w:rPr>
               <w:t>pdays</w:t>
             </w:r>
-          </w:p>
-        </w:tc>
-        <w:tc>
-          <w:tcPr>
-            <w:tcW w:w="0" w:type="auto"/>
-            <w:vAlign w:val="center"/>
-            <w:hideMark/>
-          </w:tcPr>
-          <w:p>
-            <w:pPr>
-              <w:rPr>
-                <w:lang w:val="es-ES"/>
-              </w:rPr>
-            </w:pPr>
+            <w:proofErr w:type="spellEnd"/>
+          </w:p>
+        </w:tc>
+        <w:tc>
+          <w:tcPr>
+            <w:tcW w:w="0" w:type="auto"/>
+            <w:vAlign w:val="center"/>
+            <w:hideMark/>
+          </w:tcPr>
+          <w:p>
+            <w:pPr>
+              <w:rPr>
+                <w:lang w:val="es-ES"/>
+              </w:rPr>
+            </w:pPr>
+            <w:proofErr w:type="spellStart"/>
             <w:r>
               <w:rPr>
                 <w:lang w:val="es-ES"/>
               </w:rPr>
               <w:t>previously_contacted</w:t>
             </w:r>
+            <w:proofErr w:type="spellEnd"/>
           </w:p>
         </w:tc>
         <w:tc>
@@ -954,32 +1020,36 @@
                 <w:lang w:val="es-ES"/>
               </w:rPr>
             </w:pPr>
+            <w:proofErr w:type="spellStart"/>
             <w:r>
               <w:rPr>
                 <w:lang w:val="es-ES"/>
               </w:rPr>
               <w:t>previous</w:t>
             </w:r>
-          </w:p>
-        </w:tc>
-        <w:tc>
-          <w:tcPr>
-            <w:tcW w:w="0" w:type="auto"/>
-            <w:vAlign w:val="center"/>
-            <w:hideMark/>
-          </w:tcPr>
-          <w:p>
-            <w:pPr>
-              <w:rPr>
-                <w:lang w:val="es-ES"/>
-              </w:rPr>
-            </w:pPr>
+            <w:proofErr w:type="spellEnd"/>
+          </w:p>
+        </w:tc>
+        <w:tc>
+          <w:tcPr>
+            <w:tcW w:w="0" w:type="auto"/>
+            <w:vAlign w:val="center"/>
+            <w:hideMark/>
+          </w:tcPr>
+          <w:p>
+            <w:pPr>
+              <w:rPr>
+                <w:lang w:val="es-ES"/>
+              </w:rPr>
+            </w:pPr>
+            <w:proofErr w:type="spellStart"/>
             <w:r>
               <w:rPr>
                 <w:lang w:val="es-ES"/>
               </w:rPr>
               <w:t>previous_contacts</w:t>
             </w:r>
+            <w:proofErr w:type="spellEnd"/>
           </w:p>
         </w:tc>
         <w:tc>
@@ -1019,32 +1089,36 @@
                 <w:lang w:val="es-ES"/>
               </w:rPr>
             </w:pPr>
+            <w:proofErr w:type="spellStart"/>
             <w:r>
               <w:rPr>
                 <w:lang w:val="es-ES"/>
               </w:rPr>
               <w:t>poutcome</w:t>
             </w:r>
-          </w:p>
-        </w:tc>
-        <w:tc>
-          <w:tcPr>
-            <w:tcW w:w="0" w:type="auto"/>
-            <w:vAlign w:val="center"/>
-            <w:hideMark/>
-          </w:tcPr>
-          <w:p>
-            <w:pPr>
-              <w:rPr>
-                <w:lang w:val="es-ES"/>
-              </w:rPr>
-            </w:pPr>
+            <w:proofErr w:type="spellEnd"/>
+          </w:p>
+        </w:tc>
+        <w:tc>
+          <w:tcPr>
+            <w:tcW w:w="0" w:type="auto"/>
+            <w:vAlign w:val="center"/>
+            <w:hideMark/>
+          </w:tcPr>
+          <w:p>
+            <w:pPr>
+              <w:rPr>
+                <w:lang w:val="es-ES"/>
+              </w:rPr>
+            </w:pPr>
+            <w:proofErr w:type="spellStart"/>
             <w:r>
               <w:rPr>
                 <w:lang w:val="es-ES"/>
               </w:rPr>
               <w:t>previous_campaign_outcome</w:t>
             </w:r>
+            <w:proofErr w:type="spellEnd"/>
           </w:p>
         </w:tc>
         <w:tc>
@@ -1104,12 +1178,14 @@
                 <w:lang w:val="es-ES"/>
               </w:rPr>
             </w:pPr>
+            <w:proofErr w:type="spellStart"/>
             <w:r>
               <w:rPr>
                 <w:lang w:val="es-ES"/>
               </w:rPr>
               <w:t>subscribed</w:t>
             </w:r>
+            <w:proofErr w:type="spellEnd"/>
           </w:p>
         </w:tc>
         <w:tc>
@@ -1214,32 +1290,38 @@
                 <w:lang w:val="es-ES"/>
               </w:rPr>
             </w:pPr>
+            <w:proofErr w:type="spellStart"/>
+            <w:proofErr w:type="gramStart"/>
             <w:r>
               <w:rPr>
                 <w:lang w:val="es-ES"/>
               </w:rPr>
               <w:t>nr.employed</w:t>
             </w:r>
-          </w:p>
-        </w:tc>
-        <w:tc>
-          <w:tcPr>
-            <w:tcW w:w="0" w:type="auto"/>
-            <w:vAlign w:val="center"/>
-            <w:hideMark/>
-          </w:tcPr>
-          <w:p>
-            <w:pPr>
-              <w:rPr>
-                <w:lang w:val="es-ES"/>
-              </w:rPr>
-            </w:pPr>
+            <w:proofErr w:type="spellEnd"/>
+            <w:proofErr w:type="gramEnd"/>
+          </w:p>
+        </w:tc>
+        <w:tc>
+          <w:tcPr>
+            <w:tcW w:w="0" w:type="auto"/>
+            <w:vAlign w:val="center"/>
+            <w:hideMark/>
+          </w:tcPr>
+          <w:p>
+            <w:pPr>
+              <w:rPr>
+                <w:lang w:val="es-ES"/>
+              </w:rPr>
+            </w:pPr>
+            <w:proofErr w:type="spellStart"/>
             <w:r>
               <w:rPr>
                 <w:lang w:val="es-ES"/>
               </w:rPr>
               <w:t>total_employment</w:t>
             </w:r>
+            <w:proofErr w:type="spellEnd"/>
           </w:p>
         </w:tc>
         <w:tc>
@@ -1279,32 +1361,36 @@
                 <w:lang w:val="es-ES"/>
               </w:rPr>
             </w:pPr>
+            <w:proofErr w:type="spellStart"/>
             <w:r>
               <w:rPr>
                 <w:lang w:val="es-ES"/>
               </w:rPr>
               <w:t>cons.price.idx</w:t>
             </w:r>
-          </w:p>
-        </w:tc>
-        <w:tc>
-          <w:tcPr>
-            <w:tcW w:w="0" w:type="auto"/>
-            <w:vAlign w:val="center"/>
-            <w:hideMark/>
-          </w:tcPr>
-          <w:p>
-            <w:pPr>
-              <w:rPr>
-                <w:lang w:val="es-ES"/>
-              </w:rPr>
-            </w:pPr>
+            <w:proofErr w:type="spellEnd"/>
+          </w:p>
+        </w:tc>
+        <w:tc>
+          <w:tcPr>
+            <w:tcW w:w="0" w:type="auto"/>
+            <w:vAlign w:val="center"/>
+            <w:hideMark/>
+          </w:tcPr>
+          <w:p>
+            <w:pPr>
+              <w:rPr>
+                <w:lang w:val="es-ES"/>
+              </w:rPr>
+            </w:pPr>
+            <w:proofErr w:type="spellStart"/>
             <w:r>
               <w:rPr>
                 <w:lang w:val="es-ES"/>
               </w:rPr>
               <w:t>consumer_price_index</w:t>
             </w:r>
+            <w:proofErr w:type="spellEnd"/>
           </w:p>
         </w:tc>
         <w:tc>
@@ -1344,32 +1430,38 @@
                 <w:lang w:val="es-ES"/>
               </w:rPr>
             </w:pPr>
+            <w:proofErr w:type="spellStart"/>
+            <w:proofErr w:type="gramStart"/>
             <w:r>
               <w:rPr>
                 <w:lang w:val="es-ES"/>
               </w:rPr>
               <w:t>emp.var.rate</w:t>
             </w:r>
-          </w:p>
-        </w:tc>
-        <w:tc>
-          <w:tcPr>
-            <w:tcW w:w="0" w:type="auto"/>
-            <w:vAlign w:val="center"/>
-            <w:hideMark/>
-          </w:tcPr>
-          <w:p>
-            <w:pPr>
-              <w:rPr>
-                <w:lang w:val="es-ES"/>
-              </w:rPr>
-            </w:pPr>
+            <w:proofErr w:type="spellEnd"/>
+            <w:proofErr w:type="gramEnd"/>
+          </w:p>
+        </w:tc>
+        <w:tc>
+          <w:tcPr>
+            <w:tcW w:w="0" w:type="auto"/>
+            <w:vAlign w:val="center"/>
+            <w:hideMark/>
+          </w:tcPr>
+          <w:p>
+            <w:pPr>
+              <w:rPr>
+                <w:lang w:val="es-ES"/>
+              </w:rPr>
+            </w:pPr>
+            <w:proofErr w:type="spellStart"/>
             <w:r>
               <w:rPr>
                 <w:lang w:val="es-ES"/>
               </w:rPr>
               <w:t>employment_variation_rate</w:t>
             </w:r>
+            <w:proofErr w:type="spellEnd"/>
           </w:p>
         </w:tc>
         <w:tc>
@@ -1409,32 +1501,36 @@
                 <w:lang w:val="es-ES"/>
               </w:rPr>
             </w:pPr>
+            <w:proofErr w:type="spellStart"/>
             <w:r>
               <w:rPr>
                 <w:lang w:val="es-ES"/>
               </w:rPr>
               <w:t>cons.conf.idx</w:t>
             </w:r>
-          </w:p>
-        </w:tc>
-        <w:tc>
-          <w:tcPr>
-            <w:tcW w:w="0" w:type="auto"/>
-            <w:vAlign w:val="center"/>
-            <w:hideMark/>
-          </w:tcPr>
-          <w:p>
-            <w:pPr>
-              <w:rPr>
-                <w:lang w:val="es-ES"/>
-              </w:rPr>
-            </w:pPr>
+            <w:proofErr w:type="spellEnd"/>
+          </w:p>
+        </w:tc>
+        <w:tc>
+          <w:tcPr>
+            <w:tcW w:w="0" w:type="auto"/>
+            <w:vAlign w:val="center"/>
+            <w:hideMark/>
+          </w:tcPr>
+          <w:p>
+            <w:pPr>
+              <w:rPr>
+                <w:lang w:val="es-ES"/>
+              </w:rPr>
+            </w:pPr>
+            <w:proofErr w:type="spellStart"/>
             <w:r>
               <w:rPr>
                 <w:lang w:val="es-ES"/>
               </w:rPr>
               <w:t>consumer_confidence_index</w:t>
             </w:r>
+            <w:proofErr w:type="spellEnd"/>
           </w:p>
         </w:tc>
         <w:tc>
@@ -1470,7 +1566,7 @@
           <w:lang w:val="es-ES"/>
         </w:rPr>
         <w:pict w14:anchorId="579F5C4E">
-          <v:rect id="_x0000_i1061" style="width:0;height:1.5pt" o:hralign="center" o:hrstd="t" o:hr="t" fillcolor="#a0a0a0" stroked="f"/>
+          <v:rect id="_x0000_i1025" style="width:0;height:1.5pt" o:hralign="center" o:hrstd="t" o:hr="t" fillcolor="#a0a0a0" stroked="f"/>
         </w:pict>
       </w:r>
     </w:p>
@@ -1517,6 +1613,7 @@
         </w:rPr>
         <w:t xml:space="preserve"> y </w:t>
       </w:r>
+      <w:proofErr w:type="spellStart"/>
       <w:r>
         <w:rPr>
           <w:b/>
@@ -1525,6 +1622,7 @@
         </w:rPr>
         <w:t>cons.price.idx</w:t>
       </w:r>
+      <w:proofErr w:type="spellEnd"/>
       <w:r>
         <w:rPr>
           <w:lang w:val="es-ES"/>
@@ -1561,8 +1659,18 @@
           <w:bCs/>
           <w:lang w:val="es-ES"/>
         </w:rPr>
-        <w:t>Euribor 3-month rate</w:t>
-      </w:r>
+        <w:t xml:space="preserve">Euribor 3-month </w:t>
+      </w:r>
+      <w:proofErr w:type="spellStart"/>
+      <w:r>
+        <w:rPr>
+          <w:b/>
+          <w:bCs/>
+          <w:lang w:val="es-ES"/>
+        </w:rPr>
+        <w:t>rate</w:t>
+      </w:r>
+      <w:proofErr w:type="spellEnd"/>
       <w:r>
         <w:rPr>
           <w:lang w:val="es-ES"/>
@@ -1588,26 +1696,46 @@
           <w:lang w:val="es-ES"/>
         </w:rPr>
       </w:pPr>
+      <w:proofErr w:type="spellStart"/>
       <w:r>
         <w:rPr>
           <w:b/>
           <w:bCs/>
           <w:lang w:val="es-ES"/>
         </w:rPr>
-        <w:t>Consumer Price Index</w:t>
-      </w:r>
-      <w:r>
-        <w:rPr>
-          <w:lang w:val="es-ES"/>
-        </w:rPr>
-        <w:t xml:space="preserve"> se dividió entre </w:t>
-      </w:r>
+        <w:t>Consumer</w:t>
+      </w:r>
+      <w:proofErr w:type="spellEnd"/>
       <w:r>
         <w:rPr>
           <w:b/>
           <w:bCs/>
           <w:lang w:val="es-ES"/>
         </w:rPr>
+        <w:t xml:space="preserve"> Price </w:t>
+      </w:r>
+      <w:proofErr w:type="spellStart"/>
+      <w:r>
+        <w:rPr>
+          <w:b/>
+          <w:bCs/>
+          <w:lang w:val="es-ES"/>
+        </w:rPr>
+        <w:t>Index</w:t>
+      </w:r>
+      <w:proofErr w:type="spellEnd"/>
+      <w:r>
+        <w:rPr>
+          <w:lang w:val="es-ES"/>
+        </w:rPr>
+        <w:t xml:space="preserve"> se dividió entre </w:t>
+      </w:r>
+      <w:r>
+        <w:rPr>
+          <w:b/>
+          <w:bCs/>
+          <w:lang w:val="es-ES"/>
+        </w:rPr>
         <w:t>1.000</w:t>
       </w:r>
     </w:p>
@@ -1621,7 +1749,21 @@
         <w:rPr>
           <w:lang w:val="es-ES"/>
         </w:rPr>
-        <w:t>Esto se debe a que en el dataset estas variables estaban almacenadas en una escala multiplicada.</w:t>
+        <w:t xml:space="preserve">Esto se debe a que en el </w:t>
+      </w:r>
+      <w:proofErr w:type="spellStart"/>
+      <w:r>
+        <w:rPr>
+          <w:lang w:val="es-ES"/>
+        </w:rPr>
+        <w:t>dataset</w:t>
+      </w:r>
+      <w:proofErr w:type="spellEnd"/>
+      <w:r>
+        <w:rPr>
+          <w:lang w:val="es-ES"/>
+        </w:rPr>
+        <w:t xml:space="preserve"> estas variables estaban almacenadas en una escala multiplicada.</w:t>
       </w:r>
     </w:p>
     <w:p>
@@ -1802,7 +1944,7 @@
           <w:lang w:val="es-ES"/>
         </w:rPr>
         <w:pict w14:anchorId="17A4FBDF">
-          <v:rect id="_x0000_i1062" style="width:0;height:1.5pt" o:hralign="center" o:hrstd="t" o:hr="t" fillcolor="#a0a0a0" stroked="f"/>
+          <v:rect id="_x0000_i1026" style="width:0;height:1.5pt" o:hralign="center" o:hrstd="t" o:hr="t" fillcolor="#a0a0a0" stroked="f"/>
         </w:pict>
       </w:r>
     </w:p>
@@ -1835,6 +1977,7 @@
         </w:rPr>
         <w:t xml:space="preserve">Se han eliminado los registros duplicados considerando todas las columnas excepto la variable objetivo </w:t>
       </w:r>
+      <w:proofErr w:type="spellStart"/>
       <w:r>
         <w:rPr>
           <w:b/>
@@ -1843,6 +1986,7 @@
         </w:rPr>
         <w:t>outcome</w:t>
       </w:r>
+      <w:proofErr w:type="spellEnd"/>
       <w:r>
         <w:rPr>
           <w:lang w:val="es-ES"/>
@@ -1873,6 +2017,7 @@
           <w:lang w:val="es-ES"/>
         </w:rPr>
       </w:pPr>
+      <w:proofErr w:type="spellStart"/>
       <w:r>
         <w:rPr>
           <w:i/>
@@ -1881,6 +2026,7 @@
         </w:rPr>
         <w:t>outcome</w:t>
       </w:r>
+      <w:proofErr w:type="spellEnd"/>
       <w:r>
         <w:rPr>
           <w:lang w:val="es-ES"/>
@@ -1997,7 +2143,7 @@
           <w:lang w:val="es-ES"/>
         </w:rPr>
         <w:pict w14:anchorId="2F5F6431">
-          <v:rect id="_x0000_i1063" style="width:0;height:1.5pt" o:hralign="center" o:hrstd="t" o:hr="t" fillcolor="#a0a0a0" stroked="f"/>
+          <v:rect id="_x0000_i1027" style="width:0;height:1.5pt" o:hralign="center" o:hrstd="t" o:hr="t" fillcolor="#a0a0a0" stroked="f"/>
         </w:pict>
       </w:r>
     </w:p>
@@ -2030,6 +2176,7 @@
         </w:rPr>
         <w:t xml:space="preserve">Se han convertido las columnas </w:t>
       </w:r>
+      <w:proofErr w:type="spellStart"/>
       <w:r>
         <w:rPr>
           <w:b/>
@@ -2038,12 +2185,14 @@
         </w:rPr>
         <w:t>contact_month</w:t>
       </w:r>
+      <w:proofErr w:type="spellEnd"/>
       <w:r>
         <w:rPr>
           <w:lang w:val="es-ES"/>
         </w:rPr>
         <w:t xml:space="preserve"> y </w:t>
       </w:r>
+      <w:proofErr w:type="spellStart"/>
       <w:r>
         <w:rPr>
           <w:b/>
@@ -2052,11 +2201,28 @@
         </w:rPr>
         <w:t>contact_day</w:t>
       </w:r>
-      <w:r>
-        <w:rPr>
-          <w:lang w:val="es-ES"/>
-        </w:rPr>
-        <w:t xml:space="preserve"> en variables categóricas ordenadas usando pd.Categorical.</w:t>
+      <w:proofErr w:type="spellEnd"/>
+      <w:r>
+        <w:rPr>
+          <w:lang w:val="es-ES"/>
+        </w:rPr>
+        <w:t xml:space="preserve"> en variables categóricas ordenadas usando </w:t>
+      </w:r>
+      <w:proofErr w:type="spellStart"/>
+      <w:proofErr w:type="gramStart"/>
+      <w:r>
+        <w:rPr>
+          <w:lang w:val="es-ES"/>
+        </w:rPr>
+        <w:t>pd.Categorical</w:t>
+      </w:r>
+      <w:proofErr w:type="spellEnd"/>
+      <w:proofErr w:type="gramEnd"/>
+      <w:r>
+        <w:rPr>
+          <w:lang w:val="es-ES"/>
+        </w:rPr>
+        <w:t>.</w:t>
       </w:r>
     </w:p>
     <w:p>
@@ -2094,8 +2260,18 @@
           <w:bCs/>
           <w:lang w:val="es-ES"/>
         </w:rPr>
-        <w:t>mar → dec</w:t>
-      </w:r>
+        <w:t xml:space="preserve">mar → </w:t>
+      </w:r>
+      <w:proofErr w:type="spellStart"/>
+      <w:r>
+        <w:rPr>
+          <w:b/>
+          <w:bCs/>
+          <w:lang w:val="es-ES"/>
+        </w:rPr>
+        <w:t>dec</w:t>
+      </w:r>
+      <w:proofErr w:type="spellEnd"/>
       <w:r>
         <w:rPr>
           <w:lang w:val="es-ES"/>
@@ -2119,14 +2295,34 @@
         </w:rPr>
         <w:t>Se definió un orden lógico de días (</w:t>
       </w:r>
+      <w:proofErr w:type="spellStart"/>
       <w:r>
         <w:rPr>
           <w:b/>
           <w:bCs/>
           <w:lang w:val="es-ES"/>
         </w:rPr>
-        <w:t>mon → fri</w:t>
-      </w:r>
+        <w:t>mon</w:t>
+      </w:r>
+      <w:proofErr w:type="spellEnd"/>
+      <w:r>
+        <w:rPr>
+          <w:b/>
+          <w:bCs/>
+          <w:lang w:val="es-ES"/>
+        </w:rPr>
+        <w:t xml:space="preserve"> → </w:t>
+      </w:r>
+      <w:proofErr w:type="spellStart"/>
+      <w:r>
+        <w:rPr>
+          <w:b/>
+          <w:bCs/>
+          <w:lang w:val="es-ES"/>
+        </w:rPr>
+        <w:t>fri</w:t>
+      </w:r>
+      <w:proofErr w:type="spellEnd"/>
       <w:r>
         <w:rPr>
           <w:lang w:val="es-ES"/>
@@ -2209,7 +2405,7 @@
           <w:lang w:val="es-ES"/>
         </w:rPr>
         <w:pict w14:anchorId="79937EE5">
-          <v:rect id="_x0000_i1064" style="width:0;height:1.5pt" o:hralign="center" o:hrstd="t" o:hr="t" fillcolor="#a0a0a0" stroked="f"/>
+          <v:rect id="_x0000_i1028" style="width:0;height:1.5pt" o:hralign="center" o:hrstd="t" o:hr="t" fillcolor="#a0a0a0" stroked="f"/>
         </w:pict>
       </w:r>
     </w:p>
@@ -2229,6 +2425,7 @@
         </w:rPr>
         <w:t xml:space="preserve">Tratamiento de valores </w:t>
       </w:r>
+      <w:proofErr w:type="spellStart"/>
       <w:r>
         <w:rPr>
           <w:b/>
@@ -2239,6 +2436,7 @@
         </w:rPr>
         <w:t>unknown</w:t>
       </w:r>
+      <w:proofErr w:type="spellEnd"/>
     </w:p>
     <w:p>
       <w:pPr>
@@ -2252,6 +2450,7 @@
         </w:rPr>
         <w:t xml:space="preserve">Se han eliminado las filas con valor </w:t>
       </w:r>
+      <w:proofErr w:type="spellStart"/>
       <w:r>
         <w:rPr>
           <w:b/>
@@ -2260,6 +2459,7 @@
         </w:rPr>
         <w:t>unknown</w:t>
       </w:r>
+      <w:proofErr w:type="spellEnd"/>
       <w:r>
         <w:rPr>
           <w:lang w:val="es-ES"/>
@@ -2277,6 +2477,7 @@
           <w:lang w:val="es-ES"/>
         </w:rPr>
       </w:pPr>
+      <w:proofErr w:type="spellStart"/>
       <w:r>
         <w:rPr>
           <w:b/>
@@ -2285,6 +2486,7 @@
         </w:rPr>
         <w:t>has_housing_loan</w:t>
       </w:r>
+      <w:proofErr w:type="spellEnd"/>
     </w:p>
     <w:p>
       <w:pPr>
@@ -2296,6 +2498,7 @@
           <w:lang w:val="es-ES"/>
         </w:rPr>
       </w:pPr>
+      <w:proofErr w:type="spellStart"/>
       <w:r>
         <w:rPr>
           <w:b/>
@@ -2304,6 +2507,7 @@
         </w:rPr>
         <w:t>has_personal_loan</w:t>
       </w:r>
+      <w:proofErr w:type="spellEnd"/>
     </w:p>
     <w:p>
       <w:pPr>
@@ -2346,8 +2550,16 @@
         <w:rPr>
           <w:lang w:val="es-ES"/>
         </w:rPr>
-        <w:t xml:space="preserve"> del dataset</w:t>
-      </w:r>
+        <w:t xml:space="preserve"> del </w:t>
+      </w:r>
+      <w:proofErr w:type="spellStart"/>
+      <w:r>
+        <w:rPr>
+          <w:lang w:val="es-ES"/>
+        </w:rPr>
+        <w:t>dataset</w:t>
+      </w:r>
+      <w:proofErr w:type="spellEnd"/>
     </w:p>
     <w:p>
       <w:pPr>
@@ -2393,7 +2605,21 @@
         <w:rPr>
           <w:lang w:val="es-ES"/>
         </w:rPr>
-        <w:t>Esto minimiza el ruido sin afectar significativamente el tamaño del dataset.</w:t>
+        <w:t xml:space="preserve">Esto minimiza el ruido sin afectar significativamente el tamaño del </w:t>
+      </w:r>
+      <w:proofErr w:type="spellStart"/>
+      <w:r>
+        <w:rPr>
+          <w:lang w:val="es-ES"/>
+        </w:rPr>
+        <w:t>dataset</w:t>
+      </w:r>
+      <w:proofErr w:type="spellEnd"/>
+      <w:r>
+        <w:rPr>
+          <w:lang w:val="es-ES"/>
+        </w:rPr>
+        <w:t>.</w:t>
       </w:r>
     </w:p>
     <w:p>
@@ -2407,7 +2633,7 @@
           <w:lang w:val="es-ES"/>
         </w:rPr>
         <w:pict w14:anchorId="2A7801E4">
-          <v:rect id="_x0000_i1065" style="width:0;height:1.5pt" o:hralign="center" o:hrstd="t" o:hr="t" fillcolor="#a0a0a0" stroked="f"/>
+          <v:rect id="_x0000_i1029" style="width:0;height:1.5pt" o:hralign="center" o:hrstd="t" o:hr="t" fillcolor="#a0a0a0" stroked="f"/>
         </w:pict>
       </w:r>
     </w:p>
@@ -2419,44 +2645,88 @@
           <w:lang w:val="es-ES"/>
         </w:rPr>
       </w:pPr>
+      <w:proofErr w:type="spellStart"/>
       <w:r>
         <w:rPr>
           <w:b/>
           <w:bCs/>
           <w:lang w:val="es-ES"/>
         </w:rPr>
-        <w:t>Feature engineering</w:t>
-      </w:r>
-    </w:p>
-    <w:p>
-      <w:pPr>
-        <w:rPr>
-          <w:lang w:val="es-ES"/>
-        </w:rPr>
-      </w:pPr>
-      <w:r>
-        <w:rPr>
-          <w:lang w:val="es-ES"/>
-        </w:rPr>
-        <w:t>Se han creado nuevas variables derivadas para mejorar la capacidad explicativa del dataset.</w:t>
-      </w:r>
-    </w:p>
-    <w:p>
-      <w:pPr>
+        <w:t>Feature</w:t>
+      </w:r>
+      <w:proofErr w:type="spellEnd"/>
+      <w:r>
         <w:rPr>
           <w:b/>
           <w:bCs/>
           <w:lang w:val="es-ES"/>
         </w:rPr>
-      </w:pPr>
+        <w:t xml:space="preserve"> </w:t>
+      </w:r>
+      <w:proofErr w:type="spellStart"/>
       <w:r>
         <w:rPr>
           <w:b/>
           <w:bCs/>
           <w:lang w:val="es-ES"/>
         </w:rPr>
-        <w:t>Variable is_new_campaign_client</w:t>
-      </w:r>
+        <w:t>engineering</w:t>
+      </w:r>
+      <w:proofErr w:type="spellEnd"/>
+    </w:p>
+    <w:p>
+      <w:pPr>
+        <w:rPr>
+          <w:lang w:val="es-ES"/>
+        </w:rPr>
+      </w:pPr>
+      <w:r>
+        <w:rPr>
+          <w:lang w:val="es-ES"/>
+        </w:rPr>
+        <w:t xml:space="preserve">Se han creado nuevas variables derivadas para mejorar la capacidad explicativa del </w:t>
+      </w:r>
+      <w:proofErr w:type="spellStart"/>
+      <w:r>
+        <w:rPr>
+          <w:lang w:val="es-ES"/>
+        </w:rPr>
+        <w:t>dataset</w:t>
+      </w:r>
+      <w:proofErr w:type="spellEnd"/>
+      <w:r>
+        <w:rPr>
+          <w:lang w:val="es-ES"/>
+        </w:rPr>
+        <w:t>.</w:t>
+      </w:r>
+    </w:p>
+    <w:p>
+      <w:pPr>
+        <w:rPr>
+          <w:b/>
+          <w:bCs/>
+          <w:lang w:val="es-ES"/>
+        </w:rPr>
+      </w:pPr>
+      <w:r>
+        <w:rPr>
+          <w:b/>
+          <w:bCs/>
+          <w:lang w:val="es-ES"/>
+        </w:rPr>
+        <w:t xml:space="preserve">Variable </w:t>
+      </w:r>
+      <w:proofErr w:type="spellStart"/>
+      <w:r>
+        <w:rPr>
+          <w:b/>
+          <w:bCs/>
+          <w:lang w:val="es-ES"/>
+        </w:rPr>
+        <w:t>is_new_campaign_client</w:t>
+      </w:r>
+      <w:proofErr w:type="spellEnd"/>
     </w:p>
     <w:p>
       <w:pPr>
@@ -2471,6 +2741,7 @@
         <w:lastRenderedPageBreak/>
         <w:t xml:space="preserve">Se añadió la columna </w:t>
       </w:r>
+      <w:proofErr w:type="spellStart"/>
       <w:r>
         <w:rPr>
           <w:b/>
@@ -2479,6 +2750,7 @@
         </w:rPr>
         <w:t>is_new_campaign_client</w:t>
       </w:r>
+      <w:proofErr w:type="spellEnd"/>
       <w:r>
         <w:rPr>
           <w:lang w:val="es-ES"/>
@@ -2508,7 +2780,21 @@
         <w:rPr>
           <w:lang w:val="es-ES"/>
         </w:rPr>
-        <w:t xml:space="preserve"> → clientes nuevos (previous_contacts = 0)</w:t>
+        <w:t xml:space="preserve"> → clientes nuevos (</w:t>
+      </w:r>
+      <w:proofErr w:type="spellStart"/>
+      <w:r>
+        <w:rPr>
+          <w:lang w:val="es-ES"/>
+        </w:rPr>
+        <w:t>previous_contacts</w:t>
+      </w:r>
+      <w:proofErr w:type="spellEnd"/>
+      <w:r>
+        <w:rPr>
+          <w:lang w:val="es-ES"/>
+        </w:rPr>
+        <w:t xml:space="preserve"> = 0)</w:t>
       </w:r>
     </w:p>
     <w:p>
@@ -2607,7 +2893,7 @@
           <w:lang w:val="es-ES"/>
         </w:rPr>
         <w:pict w14:anchorId="58ED547B">
-          <v:rect id="_x0000_i1066" style="width:0;height:1.5pt" o:hralign="center" o:hrstd="t" o:hr="t" fillcolor="#a0a0a0" stroked="f"/>
+          <v:rect id="_x0000_i1030" style="width:0;height:1.5pt" o:hralign="center" o:hrstd="t" o:hr="t" fillcolor="#a0a0a0" stroked="f"/>
         </w:pict>
       </w:r>
     </w:p>
@@ -2625,21 +2911,9 @@
           <w:bCs/>
           <w:lang w:val="es-ES"/>
         </w:rPr>
-        <w:t>Variable high_contact_attempts</w:t>
-      </w:r>
-    </w:p>
-    <w:p>
-      <w:pPr>
-        <w:rPr>
-          <w:lang w:val="es-ES"/>
-        </w:rPr>
-      </w:pPr>
-      <w:r>
-        <w:rPr>
-          <w:lang w:val="es-ES"/>
-        </w:rPr>
-        <w:t xml:space="preserve">Se añadió la columna </w:t>
-      </w:r>
+        <w:t xml:space="preserve">Variable </w:t>
+      </w:r>
+      <w:proofErr w:type="spellStart"/>
       <w:r>
         <w:rPr>
           <w:b/>
@@ -2648,6 +2922,30 @@
         </w:rPr>
         <w:t>high_contact_attempts</w:t>
       </w:r>
+      <w:proofErr w:type="spellEnd"/>
+    </w:p>
+    <w:p>
+      <w:pPr>
+        <w:rPr>
+          <w:lang w:val="es-ES"/>
+        </w:rPr>
+      </w:pPr>
+      <w:r>
+        <w:rPr>
+          <w:lang w:val="es-ES"/>
+        </w:rPr>
+        <w:t xml:space="preserve">Se añadió la columna </w:t>
+      </w:r>
+      <w:proofErr w:type="spellStart"/>
+      <w:r>
+        <w:rPr>
+          <w:b/>
+          <w:bCs/>
+          <w:lang w:val="es-ES"/>
+        </w:rPr>
+        <w:t>high_contact_attempts</w:t>
+      </w:r>
+      <w:proofErr w:type="spellEnd"/>
       <w:r>
         <w:rPr>
           <w:lang w:val="es-ES"/>
@@ -2753,6 +3051,26 @@
       </w:r>
     </w:p>
     <w:p/>
+    <w:p>
+      <w:pPr>
+        <w:rPr>
+          <w:b/>
+          <w:bCs/>
+        </w:rPr>
+      </w:pPr>
+      <w:r>
+        <w:rPr>
+          <w:b/>
+          <w:bCs/>
+        </w:rPr>
+        <w:t>Análisis EDA</w:t>
+      </w:r>
+    </w:p>
+    <w:p>
+      <w:r>
+        <w:t xml:space="preserve">Finalmente se hizo un análisis EDA viendo cómo se comportan las variables para obtener patrones y factores que puedan influir en la contratación del producto. </w:t>
+      </w:r>
+    </w:p>
     <w:sectPr>
       <w:pgSz w:w="11909" w:h="16834"/>
       <w:pgMar w:top="1440" w:right="1440" w:bottom="1440" w:left="1440" w:header="720" w:footer="720" w:gutter="0"/>
@@ -5375,6 +5693,7 @@
   <w:style w:type="character" w:default="1" w:styleId="Fuentedeprrafopredeter">
     <w:name w:val="Default Paragraph Font"/>
     <w:uiPriority w:val="1"/>
+    <w:semiHidden/>
     <w:unhideWhenUsed/>
   </w:style>
   <w:style w:type="table" w:default="1" w:styleId="Tablanormal">

</xml_diff>